<commit_message>
add UIPrototype/迭代评估报告.docx and README.md
</commit_message>
<xml_diff>
--- a/UIPrototype/迭代评估报告.docx
+++ b/UIPrototype/迭代评估报告.docx
@@ -1,6 +1,6 @@
 
 <file path=word/document.xml><?xml version="1.0" encoding="utf-8"?>
-<w:document xmlns:wpc="http://schemas.microsoft.com/office/word/2010/wordprocessingCanvas" xmlns:cx="http://schemas.microsoft.com/office/drawing/2014/chartex" xmlns:cx1="http://schemas.microsoft.com/office/drawing/2015/9/8/chartex" xmlns:cx2="http://schemas.microsoft.com/office/drawing/2015/10/21/chartex" xmlns:cx3="http://schemas.microsoft.com/office/drawing/2016/5/9/chartex" xmlns:cx4="http://schemas.microsoft.com/office/drawing/2016/5/10/chartex" xmlns:cx5="http://schemas.microsoft.com/office/drawing/2016/5/11/chartex" xmlns:cx6="http://schemas.microsoft.com/office/drawing/2016/5/12/chartex" xmlns:cx7="http://schemas.microsoft.com/office/drawing/2016/5/13/chartex" xmlns:cx8="http://schemas.microsoft.com/office/drawing/2016/5/14/chartex" xmlns:mc="http://schemas.openxmlformats.org/markup-compatibility/2006" xmlns:aink="http://schemas.microsoft.com/office/drawing/2016/ink" xmlns:am3d="http://schemas.microsoft.com/office/drawing/2017/model3d" xmlns:o="urn:schemas-microsoft-com:office:office" xmlns:r="http://schemas.openxmlformats.org/officeDocument/2006/relationships" xmlns:m="http://schemas.openxmlformats.org/officeDocument/2006/math" xmlns:v="urn:schemas-microsoft-com:vml" xmlns:wp14="http://schemas.microsoft.com/office/word/2010/wordprocessingDrawing" xmlns:wp="http://schemas.openxmlformats.org/drawingml/2006/wordprocessingDrawing" xmlns:w10="urn:schemas-microsoft-com:office:word" xmlns:w="http://schemas.openxmlformats.org/wordprocessingml/2006/main" xmlns:w14="http://schemas.microsoft.com/office/word/2010/wordml" xmlns:w15="http://schemas.microsoft.com/office/word/2012/wordml" xmlns:w16cex="http://schemas.microsoft.com/office/word/2018/wordml/cex" xmlns:w16cid="http://schemas.microsoft.com/office/word/2016/wordml/cid" xmlns:w16="http://schemas.microsoft.com/office/word/2018/wordml" xmlns:w16sdtdh="http://schemas.microsoft.com/office/word/2020/wordml/sdtdatahash" xmlns:w16se="http://schemas.microsoft.com/office/word/2015/wordml/symex" xmlns:wpg="http://schemas.microsoft.com/office/word/2010/wordprocessingGroup" xmlns:wpi="http://schemas.microsoft.com/office/word/2010/wordprocessingInk" xmlns:wne="http://schemas.microsoft.com/office/word/2006/wordml" xmlns:wps="http://schemas.microsoft.com/office/word/2010/wordprocessingShape" mc:Ignorable="w14 w15 w16se w16cid w16 w16cex w16sdtdh wp14">
+<w:document xmlns:wpc="http://schemas.microsoft.com/office/word/2010/wordprocessingCanvas" xmlns:cx="http://schemas.microsoft.com/office/drawing/2014/chartex" xmlns:cx1="http://schemas.microsoft.com/office/drawing/2015/9/8/chartex" xmlns:cx2="http://schemas.microsoft.com/office/drawing/2015/10/21/chartex" xmlns:cx3="http://schemas.microsoft.com/office/drawing/2016/5/9/chartex" xmlns:cx4="http://schemas.microsoft.com/office/drawing/2016/5/10/chartex" xmlns:cx5="http://schemas.microsoft.com/office/drawing/2016/5/11/chartex" xmlns:cx6="http://schemas.microsoft.com/office/drawing/2016/5/12/chartex" xmlns:cx7="http://schemas.microsoft.com/office/drawing/2016/5/13/chartex" xmlns:cx8="http://schemas.microsoft.com/office/drawing/2016/5/14/chartex" xmlns:mc="http://schemas.openxmlformats.org/markup-compatibility/2006" xmlns:aink="http://schemas.microsoft.com/office/drawing/2016/ink" xmlns:am3d="http://schemas.microsoft.com/office/drawing/2017/model3d" xmlns:o="urn:schemas-microsoft-com:office:office" xmlns:oel="http://schemas.microsoft.com/office/2019/extlst" xmlns:r="http://schemas.openxmlformats.org/officeDocument/2006/relationships" xmlns:m="http://schemas.openxmlformats.org/officeDocument/2006/math" xmlns:v="urn:schemas-microsoft-com:vml" xmlns:wp14="http://schemas.microsoft.com/office/word/2010/wordprocessingDrawing" xmlns:wp="http://schemas.openxmlformats.org/drawingml/2006/wordprocessingDrawing" xmlns:w10="urn:schemas-microsoft-com:office:word" xmlns:w="http://schemas.openxmlformats.org/wordprocessingml/2006/main" xmlns:w14="http://schemas.microsoft.com/office/word/2010/wordml" xmlns:w15="http://schemas.microsoft.com/office/word/2012/wordml" xmlns:w16cex="http://schemas.microsoft.com/office/word/2018/wordml/cex" xmlns:w16cid="http://schemas.microsoft.com/office/word/2016/wordml/cid" xmlns:w16="http://schemas.microsoft.com/office/word/2018/wordml" xmlns:w16du="http://schemas.microsoft.com/office/word/2023/wordml/word16du" xmlns:w16sdtdh="http://schemas.microsoft.com/office/word/2020/wordml/sdtdatahash" xmlns:w16sdtfl="http://schemas.microsoft.com/office/word/2024/wordml/sdtformatlock" xmlns:w16se="http://schemas.microsoft.com/office/word/2015/wordml/symex" xmlns:wpg="http://schemas.microsoft.com/office/word/2010/wordprocessingGroup" xmlns:wpi="http://schemas.microsoft.com/office/word/2010/wordprocessingInk" xmlns:wne="http://schemas.microsoft.com/office/word/2006/wordml" xmlns:wps="http://schemas.microsoft.com/office/word/2010/wordprocessingShape" mc:Ignorable="w14 w15 w16se w16cid w16 w16cex w16sdtdh w16sdtfl w16du wp14">
   <w:body>
     <w:p>
       <w:pPr>
@@ -39,21 +39,7 @@
           <w:rFonts w:ascii="宋体"/>
           <w:szCs w:val="21"/>
         </w:rPr>
-        <w:t xml:space="preserve">                             </w:t>
-      </w:r>
-      <w:r>
-        <w:rPr>
-          <w:rFonts w:ascii="宋体" w:hint="eastAsia"/>
-          <w:szCs w:val="21"/>
-        </w:rPr>
-        <w:t>评估</w:t>
-      </w:r>
-      <w:r>
-        <w:rPr>
-          <w:rFonts w:ascii="宋体" w:hint="eastAsia"/>
-          <w:szCs w:val="21"/>
-        </w:rPr>
-        <w:t>日期：</w:t>
+        <w:t>评估日期：2026.07.13</w:t>
       </w:r>
     </w:p>
     <w:tbl>
@@ -79,7 +65,6 @@
         <w:tc>
           <w:tcPr>
             <w:tcW w:w="1674" w:type="dxa"/>
-            <w:shd w:val="clear" w:color="auto" w:fill="auto"/>
           </w:tcPr>
           <w:p>
             <w:pPr>
@@ -96,21 +81,13 @@
                 <w:rFonts w:hint="eastAsia"/>
                 <w:szCs w:val="21"/>
               </w:rPr>
-              <w:t>组</w:t>
-            </w:r>
-            <w:r>
-              <w:rPr>
-                <w:rFonts w:hint="eastAsia"/>
-                <w:szCs w:val="21"/>
-              </w:rPr>
-              <w:t>号</w:t>
+              <w:t>组号</w:t>
             </w:r>
           </w:p>
         </w:tc>
         <w:tc>
           <w:tcPr>
             <w:tcW w:w="1674" w:type="dxa"/>
-            <w:shd w:val="clear" w:color="auto" w:fill="auto"/>
           </w:tcPr>
           <w:p>
             <w:pPr>
@@ -122,12 +99,18 @@
                 <w:szCs w:val="21"/>
               </w:rPr>
             </w:pPr>
+            <w:r>
+              <w:rPr>
+                <w:rFonts w:hint="eastAsia"/>
+                <w:szCs w:val="21"/>
+              </w:rPr>
+              <w:t>13</w:t>
+            </w:r>
           </w:p>
         </w:tc>
         <w:tc>
           <w:tcPr>
             <w:tcW w:w="1866" w:type="dxa"/>
-            <w:shd w:val="clear" w:color="auto" w:fill="auto"/>
           </w:tcPr>
           <w:p>
             <w:pPr>
@@ -146,23 +129,36 @@
               </w:rPr>
               <w:t>项目名称</w:t>
             </w:r>
+            <w:r>
+              <w:rPr>
+                <w:szCs w:val="21"/>
+              </w:rPr>
+              <w:t xml:space="preserve"> </w:t>
+            </w:r>
           </w:p>
         </w:tc>
         <w:tc>
           <w:tcPr>
             <w:tcW w:w="3379" w:type="dxa"/>
-            <w:shd w:val="clear" w:color="auto" w:fill="auto"/>
           </w:tcPr>
           <w:p>
             <w:pPr>
               <w:pStyle w:val="aa"/>
               <w:ind w:firstLineChars="0" w:firstLine="0"/>
+              <w:jc w:val="center"/>
               <w:rPr>
                 <w:rFonts w:eastAsia="黑体"/>
                 <w:color w:val="0070C0"/>
                 <w:szCs w:val="21"/>
               </w:rPr>
             </w:pPr>
+            <w:r>
+              <w:rPr>
+                <w:rFonts w:hint="eastAsia"/>
+                <w:szCs w:val="21"/>
+              </w:rPr>
+              <w:t>英语口语学习助手</w:t>
+            </w:r>
           </w:p>
         </w:tc>
       </w:tr>
@@ -170,7 +166,6 @@
         <w:tc>
           <w:tcPr>
             <w:tcW w:w="1674" w:type="dxa"/>
-            <w:shd w:val="clear" w:color="auto" w:fill="auto"/>
           </w:tcPr>
           <w:p>
             <w:pPr>
@@ -189,12 +184,17 @@
               </w:rPr>
               <w:t>迭代名称</w:t>
             </w:r>
+            <w:r>
+              <w:rPr>
+                <w:szCs w:val="21"/>
+              </w:rPr>
+              <w:t xml:space="preserve"> </w:t>
+            </w:r>
           </w:p>
         </w:tc>
         <w:tc>
           <w:tcPr>
             <w:tcW w:w="1674" w:type="dxa"/>
-            <w:shd w:val="clear" w:color="auto" w:fill="auto"/>
           </w:tcPr>
           <w:p>
             <w:pPr>
@@ -206,12 +206,18 @@
                 <w:szCs w:val="21"/>
               </w:rPr>
             </w:pPr>
+            <w:r>
+              <w:rPr>
+                <w:rFonts w:hint="eastAsia"/>
+                <w:szCs w:val="21"/>
+              </w:rPr>
+              <w:t>界面原型迭代</w:t>
+            </w:r>
           </w:p>
         </w:tc>
         <w:tc>
           <w:tcPr>
             <w:tcW w:w="1866" w:type="dxa"/>
-            <w:shd w:val="clear" w:color="auto" w:fill="auto"/>
           </w:tcPr>
           <w:p>
             <w:pPr>
@@ -228,14 +234,13 @@
                 <w:rFonts w:hint="eastAsia"/>
                 <w:szCs w:val="21"/>
               </w:rPr>
-              <w:t>实际起止日期</w:t>
+              <w:t>实际起止日期：</w:t>
             </w:r>
           </w:p>
         </w:tc>
         <w:tc>
           <w:tcPr>
             <w:tcW w:w="3379" w:type="dxa"/>
-            <w:shd w:val="clear" w:color="auto" w:fill="auto"/>
           </w:tcPr>
           <w:p>
             <w:pPr>
@@ -247,6 +252,13 @@
                 <w:szCs w:val="21"/>
               </w:rPr>
             </w:pPr>
+            <w:r>
+              <w:rPr>
+                <w:rFonts w:hint="eastAsia"/>
+                <w:szCs w:val="21"/>
+              </w:rPr>
+              <w:t>2026.07.06 - 2026.07.13</w:t>
+            </w:r>
           </w:p>
         </w:tc>
       </w:tr>
@@ -255,7 +267,6 @@
           <w:tcPr>
             <w:tcW w:w="8593" w:type="dxa"/>
             <w:gridSpan w:val="4"/>
-            <w:shd w:val="clear" w:color="auto" w:fill="auto"/>
           </w:tcPr>
           <w:p>
             <w:pPr>
@@ -271,86 +282,344 @@
                 <w:rFonts w:hint="eastAsia"/>
                 <w:szCs w:val="21"/>
               </w:rPr>
-              <w:t>任务达成情况：（完成的任务</w:t>
-            </w:r>
-            <w:r>
-              <w:rPr>
-                <w:rFonts w:hint="eastAsia"/>
-                <w:szCs w:val="21"/>
-              </w:rPr>
-              <w:t>和</w:t>
-            </w:r>
-            <w:r>
-              <w:rPr>
-                <w:rFonts w:hint="eastAsia"/>
-                <w:szCs w:val="21"/>
-              </w:rPr>
-              <w:t>实现的</w:t>
-            </w:r>
-            <w:r>
-              <w:rPr>
-                <w:rFonts w:hint="eastAsia"/>
-                <w:szCs w:val="21"/>
-              </w:rPr>
-              <w:t>需求</w:t>
-            </w:r>
-            <w:r>
-              <w:rPr>
-                <w:rFonts w:hint="eastAsia"/>
-                <w:szCs w:val="21"/>
-              </w:rPr>
-              <w:t>等）</w:t>
-            </w:r>
-          </w:p>
-          <w:p>
-            <w:pPr>
-              <w:adjustRightInd w:val="0"/>
-              <w:snapToGrid w:val="0"/>
-              <w:spacing w:line="460" w:lineRule="atLeast"/>
-              <w:rPr>
-                <w:szCs w:val="21"/>
-              </w:rPr>
-            </w:pPr>
-          </w:p>
-          <w:p>
-            <w:pPr>
-              <w:adjustRightInd w:val="0"/>
-              <w:snapToGrid w:val="0"/>
-              <w:spacing w:line="460" w:lineRule="atLeast"/>
-              <w:rPr>
-                <w:szCs w:val="21"/>
-              </w:rPr>
-            </w:pPr>
-          </w:p>
-          <w:p>
-            <w:pPr>
-              <w:adjustRightInd w:val="0"/>
-              <w:snapToGrid w:val="0"/>
-              <w:spacing w:line="460" w:lineRule="atLeast"/>
-              <w:rPr>
-                <w:szCs w:val="21"/>
-              </w:rPr>
-            </w:pPr>
-          </w:p>
-          <w:p>
-            <w:pPr>
-              <w:adjustRightInd w:val="0"/>
-              <w:snapToGrid w:val="0"/>
-              <w:spacing w:line="460" w:lineRule="atLeast"/>
-              <w:rPr>
-                <w:szCs w:val="21"/>
-              </w:rPr>
-            </w:pPr>
-          </w:p>
-          <w:p>
-            <w:pPr>
-              <w:adjustRightInd w:val="0"/>
-              <w:snapToGrid w:val="0"/>
-              <w:spacing w:line="460" w:lineRule="atLeast"/>
-              <w:rPr>
-                <w:szCs w:val="21"/>
-              </w:rPr>
-            </w:pPr>
+              <w:t>任务达成情况：</w:t>
+            </w:r>
+            <w:r>
+              <w:rPr>
+                <w:rFonts w:hint="eastAsia"/>
+                <w:szCs w:val="21"/>
+              </w:rPr>
+              <w:br/>
+            </w:r>
+            <w:r>
+              <w:rPr>
+                <w:rFonts w:hint="eastAsia"/>
+                <w:szCs w:val="21"/>
+              </w:rPr>
+              <w:t>用例建模（</w:t>
+            </w:r>
+            <w:r>
+              <w:rPr>
+                <w:rFonts w:hint="eastAsia"/>
+                <w:szCs w:val="21"/>
+              </w:rPr>
+              <w:t>100%</w:t>
+            </w:r>
+            <w:r>
+              <w:rPr>
+                <w:rFonts w:hint="eastAsia"/>
+                <w:szCs w:val="21"/>
+              </w:rPr>
+              <w:t>）：完成</w:t>
+            </w:r>
+            <w:r>
+              <w:rPr>
+                <w:rFonts w:hint="eastAsia"/>
+                <w:szCs w:val="21"/>
+              </w:rPr>
+              <w:t xml:space="preserve"> use-case </w:t>
+            </w:r>
+            <w:r>
+              <w:rPr>
+                <w:rFonts w:hint="eastAsia"/>
+                <w:szCs w:val="21"/>
+              </w:rPr>
+              <w:t>图、概念类图和典型用例规约，形成主要模块的整体关系与核心使用场景。</w:t>
+            </w:r>
+            <w:r>
+              <w:rPr>
+                <w:rFonts w:hint="eastAsia"/>
+                <w:szCs w:val="21"/>
+              </w:rPr>
+              <w:br/>
+            </w:r>
+            <w:r>
+              <w:rPr>
+                <w:rFonts w:hint="eastAsia"/>
+                <w:szCs w:val="21"/>
+              </w:rPr>
+              <w:t>需求分析（</w:t>
+            </w:r>
+            <w:r>
+              <w:rPr>
+                <w:rFonts w:hint="eastAsia"/>
+                <w:szCs w:val="21"/>
+              </w:rPr>
+              <w:t>95%</w:t>
+            </w:r>
+            <w:r>
+              <w:rPr>
+                <w:rFonts w:hint="eastAsia"/>
+                <w:szCs w:val="21"/>
+              </w:rPr>
+              <w:t>）：完成市场与竞品分析、功能定义、约束、迭代计划和质量属性梳理；用户手册、</w:t>
+            </w:r>
+            <w:r>
+              <w:rPr>
+                <w:rFonts w:hint="eastAsia"/>
+                <w:szCs w:val="21"/>
+              </w:rPr>
+              <w:t xml:space="preserve">FAQ </w:t>
+            </w:r>
+            <w:r>
+              <w:rPr>
+                <w:rFonts w:hint="eastAsia"/>
+                <w:szCs w:val="21"/>
+              </w:rPr>
+              <w:t>与安装指南</w:t>
+            </w:r>
+            <w:r>
+              <w:rPr>
+                <w:rFonts w:hint="eastAsia"/>
+                <w:szCs w:val="21"/>
+              </w:rPr>
+              <w:t>尚未完成</w:t>
+            </w:r>
+            <w:r>
+              <w:rPr>
+                <w:rFonts w:hint="eastAsia"/>
+                <w:szCs w:val="21"/>
+              </w:rPr>
+              <w:t>。</w:t>
+            </w:r>
+            <w:r>
+              <w:rPr>
+                <w:rFonts w:hint="eastAsia"/>
+                <w:szCs w:val="21"/>
+              </w:rPr>
+              <w:br/>
+            </w:r>
+            <w:r>
+              <w:rPr>
+                <w:rFonts w:hint="eastAsia"/>
+                <w:szCs w:val="21"/>
+              </w:rPr>
+              <w:t>界面原型（</w:t>
+            </w:r>
+            <w:r>
+              <w:rPr>
+                <w:rFonts w:hint="eastAsia"/>
+                <w:szCs w:val="21"/>
+              </w:rPr>
+              <w:t>90%</w:t>
+            </w:r>
+            <w:r>
+              <w:rPr>
+                <w:rFonts w:hint="eastAsia"/>
+                <w:szCs w:val="21"/>
+              </w:rPr>
+              <w:t>）：完成</w:t>
+            </w:r>
+            <w:r>
+              <w:rPr>
+                <w:rFonts w:hint="eastAsia"/>
+                <w:szCs w:val="21"/>
+              </w:rPr>
+              <w:t xml:space="preserve"> Dashboard</w:t>
+            </w:r>
+            <w:r>
+              <w:rPr>
+                <w:rFonts w:hint="eastAsia"/>
+                <w:szCs w:val="21"/>
+              </w:rPr>
+              <w:t>、</w:t>
+            </w:r>
+            <w:r>
+              <w:rPr>
+                <w:rFonts w:hint="eastAsia"/>
+                <w:szCs w:val="21"/>
+              </w:rPr>
+              <w:t>Speaking</w:t>
+            </w:r>
+            <w:r>
+              <w:rPr>
+                <w:rFonts w:hint="eastAsia"/>
+                <w:szCs w:val="21"/>
+              </w:rPr>
+              <w:t>、</w:t>
+            </w:r>
+            <w:r>
+              <w:rPr>
+                <w:rFonts w:hint="eastAsia"/>
+                <w:szCs w:val="21"/>
+              </w:rPr>
+              <w:t>Vocabulary</w:t>
+            </w:r>
+            <w:r>
+              <w:rPr>
+                <w:rFonts w:hint="eastAsia"/>
+                <w:szCs w:val="21"/>
+              </w:rPr>
+              <w:t>、</w:t>
+            </w:r>
+            <w:r>
+              <w:rPr>
+                <w:rFonts w:hint="eastAsia"/>
+                <w:szCs w:val="21"/>
+              </w:rPr>
+              <w:t>Grammar</w:t>
+            </w:r>
+            <w:r>
+              <w:rPr>
+                <w:rFonts w:hint="eastAsia"/>
+                <w:szCs w:val="21"/>
+              </w:rPr>
+              <w:t>、</w:t>
+            </w:r>
+            <w:r>
+              <w:rPr>
+                <w:rFonts w:hint="eastAsia"/>
+                <w:szCs w:val="21"/>
+              </w:rPr>
+              <w:t xml:space="preserve">Profile </w:t>
+            </w:r>
+            <w:r>
+              <w:rPr>
+                <w:rFonts w:hint="eastAsia"/>
+                <w:szCs w:val="21"/>
+              </w:rPr>
+              <w:t>五个页面，并完成</w:t>
+            </w:r>
+            <w:r>
+              <w:rPr>
+                <w:rFonts w:hint="eastAsia"/>
+                <w:szCs w:val="21"/>
+              </w:rPr>
+              <w:t xml:space="preserve"> PC </w:t>
+            </w:r>
+            <w:r>
+              <w:rPr>
+                <w:rFonts w:hint="eastAsia"/>
+                <w:szCs w:val="21"/>
+              </w:rPr>
+              <w:t>端与移动端原型演示；录音存档、答题评分和个性化相关交互尚待补全。</w:t>
+            </w:r>
+            <w:r>
+              <w:rPr>
+                <w:rFonts w:hint="eastAsia"/>
+                <w:szCs w:val="21"/>
+              </w:rPr>
+              <w:br/>
+            </w:r>
+            <w:r>
+              <w:rPr>
+                <w:rFonts w:hint="eastAsia"/>
+                <w:szCs w:val="21"/>
+              </w:rPr>
+              <w:t>数据准备（</w:t>
+            </w:r>
+            <w:r>
+              <w:rPr>
+                <w:rFonts w:hint="eastAsia"/>
+                <w:szCs w:val="21"/>
+              </w:rPr>
+              <w:t>70%</w:t>
+            </w:r>
+            <w:r>
+              <w:rPr>
+                <w:rFonts w:hint="eastAsia"/>
+                <w:szCs w:val="21"/>
+              </w:rPr>
+              <w:t>）：已整理</w:t>
+            </w:r>
+            <w:r>
+              <w:rPr>
+                <w:rFonts w:hint="eastAsia"/>
+                <w:szCs w:val="21"/>
+              </w:rPr>
+              <w:t xml:space="preserve"> vocabulary.json</w:t>
+            </w:r>
+            <w:r>
+              <w:rPr>
+                <w:rFonts w:hint="eastAsia"/>
+                <w:szCs w:val="21"/>
+              </w:rPr>
+              <w:t>、</w:t>
+            </w:r>
+            <w:r>
+              <w:rPr>
+                <w:rFonts w:hint="eastAsia"/>
+                <w:szCs w:val="21"/>
+              </w:rPr>
+              <w:t xml:space="preserve">grammar_all.json </w:t>
+            </w:r>
+            <w:r>
+              <w:rPr>
+                <w:rFonts w:hint="eastAsia"/>
+                <w:szCs w:val="21"/>
+              </w:rPr>
+              <w:t>和口语场景剧本。</w:t>
+            </w:r>
+            <w:r>
+              <w:rPr>
+                <w:rFonts w:hint="eastAsia"/>
+                <w:szCs w:val="21"/>
+              </w:rPr>
+              <w:br/>
+            </w:r>
+            <w:r>
+              <w:rPr>
+                <w:rFonts w:hint="eastAsia"/>
+                <w:szCs w:val="21"/>
+              </w:rPr>
+              <w:t>后端开发（</w:t>
+            </w:r>
+            <w:r>
+              <w:rPr>
+                <w:rFonts w:hint="eastAsia"/>
+                <w:szCs w:val="21"/>
+              </w:rPr>
+              <w:t>30%</w:t>
+            </w:r>
+            <w:r>
+              <w:rPr>
+                <w:rFonts w:hint="eastAsia"/>
+                <w:szCs w:val="21"/>
+              </w:rPr>
+              <w:t>）：已引入</w:t>
+            </w:r>
+            <w:r>
+              <w:rPr>
+                <w:rFonts w:hint="eastAsia"/>
+                <w:szCs w:val="21"/>
+              </w:rPr>
+              <w:t xml:space="preserve"> FSRS Java </w:t>
+            </w:r>
+            <w:r>
+              <w:rPr>
+                <w:rFonts w:hint="eastAsia"/>
+                <w:szCs w:val="21"/>
+              </w:rPr>
+              <w:t>算法库，完成</w:t>
+            </w:r>
+            <w:r>
+              <w:rPr>
+                <w:rFonts w:hint="eastAsia"/>
+                <w:szCs w:val="21"/>
+              </w:rPr>
+              <w:t xml:space="preserve"> Spring Boot </w:t>
+            </w:r>
+            <w:r>
+              <w:rPr>
+                <w:rFonts w:hint="eastAsia"/>
+                <w:szCs w:val="21"/>
+              </w:rPr>
+              <w:t>框架、数据库初始化和</w:t>
+            </w:r>
+            <w:r>
+              <w:rPr>
+                <w:rFonts w:hint="eastAsia"/>
+                <w:szCs w:val="21"/>
+              </w:rPr>
+              <w:t xml:space="preserve"> REST </w:t>
+            </w:r>
+            <w:r>
+              <w:rPr>
+                <w:rFonts w:hint="eastAsia"/>
+                <w:szCs w:val="21"/>
+              </w:rPr>
+              <w:t>接口的基础搭建。</w:t>
+            </w:r>
           </w:p>
         </w:tc>
       </w:tr>
@@ -359,7 +628,6 @@
           <w:tcPr>
             <w:tcW w:w="8593" w:type="dxa"/>
             <w:gridSpan w:val="4"/>
-            <w:shd w:val="clear" w:color="auto" w:fill="auto"/>
           </w:tcPr>
           <w:p>
             <w:pPr>
@@ -375,93 +643,64 @@
                 <w:rFonts w:hint="eastAsia"/>
                 <w:szCs w:val="21"/>
               </w:rPr>
-              <w:t>质量情况</w:t>
-            </w:r>
-            <w:r>
-              <w:rPr>
-                <w:szCs w:val="21"/>
-              </w:rPr>
-              <w:t>：</w:t>
-            </w:r>
-            <w:r>
-              <w:rPr>
-                <w:rFonts w:hint="eastAsia"/>
-                <w:szCs w:val="21"/>
-              </w:rPr>
-              <w:t>（执</w:t>
-            </w:r>
-            <w:r>
-              <w:rPr>
-                <w:szCs w:val="21"/>
-              </w:rPr>
-              <w:t>行了</w:t>
-            </w:r>
-            <w:r>
-              <w:rPr>
-                <w:rFonts w:hint="eastAsia"/>
-                <w:szCs w:val="21"/>
-              </w:rPr>
-              <w:t>哪</w:t>
-            </w:r>
-            <w:r>
-              <w:rPr>
-                <w:szCs w:val="21"/>
-              </w:rPr>
-              <w:t>些评审和测试？评</w:t>
-            </w:r>
-            <w:r>
-              <w:rPr>
-                <w:rFonts w:hint="eastAsia"/>
-                <w:szCs w:val="21"/>
-              </w:rPr>
-              <w:t>审</w:t>
-            </w:r>
-            <w:r>
-              <w:rPr>
-                <w:szCs w:val="21"/>
-              </w:rPr>
-              <w:t>和测试的结果如何？）</w:t>
-            </w:r>
-          </w:p>
-          <w:p>
-            <w:pPr>
-              <w:adjustRightInd w:val="0"/>
-              <w:snapToGrid w:val="0"/>
-              <w:spacing w:line="460" w:lineRule="atLeast"/>
-              <w:rPr>
-                <w:szCs w:val="21"/>
-              </w:rPr>
-            </w:pPr>
-          </w:p>
-          <w:p>
-            <w:pPr>
-              <w:adjustRightInd w:val="0"/>
-              <w:snapToGrid w:val="0"/>
-              <w:spacing w:line="460" w:lineRule="atLeast"/>
-              <w:rPr>
-                <w:szCs w:val="21"/>
-              </w:rPr>
-            </w:pPr>
-          </w:p>
-          <w:p>
-            <w:pPr>
-              <w:adjustRightInd w:val="0"/>
-              <w:snapToGrid w:val="0"/>
-              <w:spacing w:line="460" w:lineRule="atLeast"/>
-              <w:rPr>
-                <w:szCs w:val="21"/>
-              </w:rPr>
-            </w:pPr>
-          </w:p>
-          <w:p>
-            <w:pPr>
-              <w:adjustRightInd w:val="0"/>
-              <w:snapToGrid w:val="0"/>
-              <w:spacing w:line="460" w:lineRule="atLeast"/>
-              <w:rPr>
-                <w:szCs w:val="21"/>
-              </w:rPr>
-            </w:pPr>
+              <w:t>质量情况：</w:t>
+            </w:r>
+            <w:r>
+              <w:rPr>
+                <w:rFonts w:hint="eastAsia"/>
+                <w:szCs w:val="21"/>
+              </w:rPr>
+              <w:br/>
+            </w:r>
+            <w:r>
+              <w:rPr>
+                <w:rFonts w:hint="eastAsia"/>
+                <w:szCs w:val="21"/>
+              </w:rPr>
+              <w:t>本次迭代以</w:t>
+            </w:r>
+            <w:r>
+              <w:rPr>
+                <w:rFonts w:hint="eastAsia"/>
+                <w:szCs w:val="21"/>
+              </w:rPr>
+              <w:t xml:space="preserve"> PC </w:t>
+            </w:r>
+            <w:r>
+              <w:rPr>
+                <w:rFonts w:hint="eastAsia"/>
+                <w:szCs w:val="21"/>
+              </w:rPr>
+              <w:t>端和移动端原型演示为主要验证方式，核对了首页、口语、词汇、语法和个性化学习五个模块的页面入口与主要流程。</w:t>
+            </w:r>
+            <w:r>
+              <w:rPr>
+                <w:rFonts w:hint="eastAsia"/>
+                <w:szCs w:val="21"/>
+              </w:rPr>
+              <w:br/>
+            </w:r>
+            <w:r>
+              <w:rPr>
+                <w:rFonts w:hint="eastAsia"/>
+                <w:szCs w:val="21"/>
+              </w:rPr>
+              <w:t>口语练习流程已覆盖情景选择、模块详情、气泡式对话、三轮对话后交卷、评分结果、问题句子与回放入口；词汇和语法练习均梳理了学习指标、练习入口、作答反馈和练习总结。</w:t>
+            </w:r>
+            <w:r>
+              <w:rPr>
+                <w:rFonts w:hint="eastAsia"/>
+                <w:szCs w:val="21"/>
+              </w:rPr>
+              <w:br/>
+            </w:r>
+            <w:r>
+              <w:rPr>
+                <w:rFonts w:hint="eastAsia"/>
+                <w:szCs w:val="21"/>
+              </w:rPr>
+              <w:t>个性化学习页面已展示用户信息、学习计划与进度、最新练习信息及登录入口，但目前仍为静态原型。</w:t>
+            </w:r>
           </w:p>
         </w:tc>
       </w:tr>
@@ -470,7 +709,6 @@
           <w:tcPr>
             <w:tcW w:w="8593" w:type="dxa"/>
             <w:gridSpan w:val="4"/>
-            <w:shd w:val="clear" w:color="auto" w:fill="auto"/>
           </w:tcPr>
           <w:p>
             <w:pPr>
@@ -486,68 +724,106 @@
                 <w:rFonts w:hint="eastAsia"/>
                 <w:szCs w:val="21"/>
               </w:rPr>
-              <w:t>问题、变更和返工：（遇到的问题、发生的变更、是否需要返工等）</w:t>
-            </w:r>
-          </w:p>
-          <w:p>
-            <w:pPr>
-              <w:adjustRightInd w:val="0"/>
-              <w:snapToGrid w:val="0"/>
-              <w:spacing w:line="460" w:lineRule="atLeast"/>
-              <w:rPr>
-                <w:szCs w:val="21"/>
-              </w:rPr>
-            </w:pPr>
-          </w:p>
-          <w:p>
-            <w:pPr>
-              <w:adjustRightInd w:val="0"/>
-              <w:snapToGrid w:val="0"/>
-              <w:spacing w:line="460" w:lineRule="atLeast"/>
-              <w:rPr>
-                <w:szCs w:val="21"/>
-              </w:rPr>
-            </w:pPr>
-          </w:p>
-          <w:p>
-            <w:pPr>
-              <w:adjustRightInd w:val="0"/>
-              <w:snapToGrid w:val="0"/>
-              <w:spacing w:line="460" w:lineRule="atLeast"/>
-              <w:rPr>
-                <w:szCs w:val="21"/>
-              </w:rPr>
-            </w:pPr>
-          </w:p>
-          <w:p>
-            <w:pPr>
-              <w:adjustRightInd w:val="0"/>
-              <w:snapToGrid w:val="0"/>
-              <w:spacing w:line="460" w:lineRule="atLeast"/>
-              <w:rPr>
-                <w:szCs w:val="21"/>
-              </w:rPr>
-            </w:pPr>
-          </w:p>
-          <w:p>
-            <w:pPr>
-              <w:adjustRightInd w:val="0"/>
-              <w:snapToGrid w:val="0"/>
-              <w:spacing w:line="460" w:lineRule="atLeast"/>
-              <w:rPr>
-                <w:szCs w:val="21"/>
-              </w:rPr>
-            </w:pPr>
-          </w:p>
-          <w:p>
-            <w:pPr>
-              <w:adjustRightInd w:val="0"/>
-              <w:snapToGrid w:val="0"/>
-              <w:spacing w:line="460" w:lineRule="atLeast"/>
-              <w:rPr>
-                <w:szCs w:val="21"/>
-              </w:rPr>
-            </w:pPr>
+              <w:t>问题、变更和返工：</w:t>
+            </w:r>
+            <w:r>
+              <w:rPr>
+                <w:rFonts w:hint="eastAsia"/>
+                <w:szCs w:val="21"/>
+              </w:rPr>
+              <w:br/>
+            </w:r>
+            <w:r>
+              <w:rPr>
+                <w:rFonts w:hint="eastAsia"/>
+                <w:szCs w:val="21"/>
+              </w:rPr>
+              <w:t>个性化学习目前仍处于静态原型阶段，尚未实现基于初始评估和学习目标自动生成每日任务的动态交互。</w:t>
+            </w:r>
+            <w:r>
+              <w:rPr>
+                <w:rFonts w:hint="eastAsia"/>
+                <w:szCs w:val="21"/>
+              </w:rPr>
+              <w:br/>
+            </w:r>
+            <w:r>
+              <w:rPr>
+                <w:rFonts w:hint="eastAsia"/>
+                <w:szCs w:val="21"/>
+              </w:rPr>
+              <w:t>录音存档、答题评分和个性化交互尚未完善；因此口语练习的评分、回放和学习数据联动仍需在后续迭代中补齐。</w:t>
+            </w:r>
+            <w:r>
+              <w:rPr>
+                <w:rFonts w:hint="eastAsia"/>
+                <w:szCs w:val="21"/>
+              </w:rPr>
+              <w:br/>
+            </w:r>
+            <w:r>
+              <w:rPr>
+                <w:rFonts w:hint="eastAsia"/>
+                <w:szCs w:val="21"/>
+              </w:rPr>
+              <w:t>数据准备完成度为</w:t>
+            </w:r>
+            <w:r>
+              <w:rPr>
+                <w:rFonts w:hint="eastAsia"/>
+                <w:szCs w:val="21"/>
+              </w:rPr>
+              <w:t xml:space="preserve"> 70%</w:t>
+            </w:r>
+            <w:r>
+              <w:rPr>
+                <w:rFonts w:hint="eastAsia"/>
+                <w:szCs w:val="21"/>
+              </w:rPr>
+              <w:t>，后端开发完成度为</w:t>
+            </w:r>
+            <w:r>
+              <w:rPr>
+                <w:rFonts w:hint="eastAsia"/>
+                <w:szCs w:val="21"/>
+              </w:rPr>
+              <w:t xml:space="preserve"> 30%</w:t>
+            </w:r>
+            <w:r>
+              <w:rPr>
+                <w:rFonts w:hint="eastAsia"/>
+                <w:szCs w:val="21"/>
+              </w:rPr>
+              <w:t>，仍需推进口语场景数据、</w:t>
+            </w:r>
+            <w:r>
+              <w:rPr>
+                <w:rFonts w:hint="eastAsia"/>
+                <w:szCs w:val="21"/>
+              </w:rPr>
+              <w:t xml:space="preserve">FSRS </w:t>
+            </w:r>
+            <w:r>
+              <w:rPr>
+                <w:rFonts w:hint="eastAsia"/>
+                <w:szCs w:val="21"/>
+              </w:rPr>
+              <w:t>复习逻辑、数据库与</w:t>
+            </w:r>
+            <w:r>
+              <w:rPr>
+                <w:rFonts w:hint="eastAsia"/>
+                <w:szCs w:val="21"/>
+              </w:rPr>
+              <w:t xml:space="preserve"> REST </w:t>
+            </w:r>
+            <w:r>
+              <w:rPr>
+                <w:rFonts w:hint="eastAsia"/>
+                <w:szCs w:val="21"/>
+              </w:rPr>
+              <w:t>接口的联调。</w:t>
+            </w:r>
           </w:p>
         </w:tc>
       </w:tr>
@@ -556,7 +832,6 @@
           <w:tcPr>
             <w:tcW w:w="8593" w:type="dxa"/>
             <w:gridSpan w:val="4"/>
-            <w:shd w:val="clear" w:color="auto" w:fill="auto"/>
           </w:tcPr>
           <w:p>
             <w:pPr>
@@ -574,72 +849,202 @@
               </w:rPr>
               <w:t>经验和教训：</w:t>
             </w:r>
-          </w:p>
-          <w:p>
-            <w:pPr>
-              <w:adjustRightInd w:val="0"/>
-              <w:snapToGrid w:val="0"/>
-              <w:spacing w:line="460" w:lineRule="atLeast"/>
-              <w:rPr>
-                <w:szCs w:val="21"/>
-              </w:rPr>
-            </w:pPr>
-          </w:p>
-          <w:p>
-            <w:pPr>
-              <w:adjustRightInd w:val="0"/>
-              <w:snapToGrid w:val="0"/>
-              <w:spacing w:line="460" w:lineRule="atLeast"/>
-              <w:rPr>
-                <w:szCs w:val="21"/>
-              </w:rPr>
-            </w:pPr>
-          </w:p>
-          <w:p>
-            <w:pPr>
-              <w:adjustRightInd w:val="0"/>
-              <w:snapToGrid w:val="0"/>
-              <w:spacing w:line="460" w:lineRule="atLeast"/>
-              <w:rPr>
-                <w:szCs w:val="21"/>
-              </w:rPr>
-            </w:pPr>
-          </w:p>
-          <w:p>
-            <w:pPr>
-              <w:adjustRightInd w:val="0"/>
-              <w:snapToGrid w:val="0"/>
-              <w:spacing w:line="460" w:lineRule="atLeast"/>
-              <w:rPr>
-                <w:szCs w:val="21"/>
-              </w:rPr>
-            </w:pPr>
-          </w:p>
-          <w:p>
-            <w:pPr>
-              <w:adjustRightInd w:val="0"/>
-              <w:snapToGrid w:val="0"/>
-              <w:spacing w:line="460" w:lineRule="atLeast"/>
-              <w:rPr>
-                <w:szCs w:val="21"/>
-              </w:rPr>
-            </w:pPr>
-          </w:p>
-          <w:p>
-            <w:pPr>
-              <w:adjustRightInd w:val="0"/>
-              <w:snapToGrid w:val="0"/>
-              <w:spacing w:line="460" w:lineRule="atLeast"/>
-              <w:rPr>
-                <w:szCs w:val="21"/>
-              </w:rPr>
-            </w:pPr>
-            <w:r>
-              <w:rPr>
-                <w:rFonts w:hint="eastAsia"/>
-                <w:szCs w:val="21"/>
-              </w:rPr>
-              <w:t xml:space="preserve">   </w:t>
+            <w:r>
+              <w:rPr>
+                <w:rFonts w:hint="eastAsia"/>
+                <w:szCs w:val="21"/>
+              </w:rPr>
+              <w:br/>
+            </w:r>
+            <w:r>
+              <w:rPr>
+                <w:rFonts w:hint="eastAsia"/>
+                <w:szCs w:val="21"/>
+              </w:rPr>
+              <w:lastRenderedPageBreak/>
+              <w:t>协作方面：开始开发前先</w:t>
+            </w:r>
+            <w:r>
+              <w:rPr>
+                <w:rFonts w:hint="eastAsia"/>
+                <w:szCs w:val="21"/>
+              </w:rPr>
+              <w:t xml:space="preserve"> pull</w:t>
+            </w:r>
+            <w:r>
+              <w:rPr>
+                <w:rFonts w:hint="eastAsia"/>
+                <w:szCs w:val="21"/>
+              </w:rPr>
+              <w:t>；合并到</w:t>
+            </w:r>
+            <w:r>
+              <w:rPr>
+                <w:rFonts w:hint="eastAsia"/>
+                <w:szCs w:val="21"/>
+              </w:rPr>
+              <w:t xml:space="preserve"> main </w:t>
+            </w:r>
+            <w:r>
+              <w:rPr>
+                <w:rFonts w:hint="eastAsia"/>
+                <w:szCs w:val="21"/>
+              </w:rPr>
+              <w:t>分支前必须发起</w:t>
+            </w:r>
+            <w:r>
+              <w:rPr>
+                <w:rFonts w:hint="eastAsia"/>
+                <w:szCs w:val="21"/>
+              </w:rPr>
+              <w:t xml:space="preserve"> PR</w:t>
+            </w:r>
+            <w:r>
+              <w:rPr>
+                <w:rFonts w:hint="eastAsia"/>
+                <w:szCs w:val="21"/>
+              </w:rPr>
+              <w:t>；相关修改和规约应及时形成文档并存入</w:t>
+            </w:r>
+            <w:r>
+              <w:rPr>
+                <w:rFonts w:hint="eastAsia"/>
+                <w:szCs w:val="21"/>
+              </w:rPr>
+              <w:t xml:space="preserve"> docs </w:t>
+            </w:r>
+            <w:r>
+              <w:rPr>
+                <w:rFonts w:hint="eastAsia"/>
+                <w:szCs w:val="21"/>
+              </w:rPr>
+              <w:t>目录。</w:t>
+            </w:r>
+            <w:r>
+              <w:rPr>
+                <w:rFonts w:hint="eastAsia"/>
+                <w:szCs w:val="21"/>
+              </w:rPr>
+              <w:br/>
+            </w:r>
+            <w:r>
+              <w:rPr>
+                <w:rFonts w:hint="eastAsia"/>
+                <w:szCs w:val="21"/>
+              </w:rPr>
+              <w:t>安全方面：数据库地址、账号密码和</w:t>
+            </w:r>
+            <w:r>
+              <w:rPr>
+                <w:rFonts w:hint="eastAsia"/>
+                <w:szCs w:val="21"/>
+              </w:rPr>
+              <w:t xml:space="preserve"> API Key </w:t>
+            </w:r>
+            <w:r>
+              <w:rPr>
+                <w:rFonts w:hint="eastAsia"/>
+                <w:szCs w:val="21"/>
+              </w:rPr>
+              <w:t>等敏感信息不得直接提交，应统一放入</w:t>
+            </w:r>
+            <w:r>
+              <w:rPr>
+                <w:rFonts w:hint="eastAsia"/>
+                <w:szCs w:val="21"/>
+              </w:rPr>
+              <w:t xml:space="preserve"> .env </w:t>
+            </w:r>
+            <w:r>
+              <w:rPr>
+                <w:rFonts w:hint="eastAsia"/>
+                <w:szCs w:val="21"/>
+              </w:rPr>
+              <w:t>并写入</w:t>
+            </w:r>
+            <w:r>
+              <w:rPr>
+                <w:rFonts w:hint="eastAsia"/>
+                <w:szCs w:val="21"/>
+              </w:rPr>
+              <w:t xml:space="preserve"> .gitignore</w:t>
+            </w:r>
+            <w:r>
+              <w:rPr>
+                <w:rFonts w:hint="eastAsia"/>
+                <w:szCs w:val="21"/>
+              </w:rPr>
+              <w:t>，仓库仅保留</w:t>
+            </w:r>
+            <w:r>
+              <w:rPr>
+                <w:rFonts w:hint="eastAsia"/>
+                <w:szCs w:val="21"/>
+              </w:rPr>
+              <w:t xml:space="preserve"> .env.example </w:t>
+            </w:r>
+            <w:r>
+              <w:rPr>
+                <w:rFonts w:hint="eastAsia"/>
+                <w:szCs w:val="21"/>
+              </w:rPr>
+              <w:t>说明所需字段；网站账号密码的存储也应遵循同样原则。</w:t>
+            </w:r>
+            <w:r>
+              <w:rPr>
+                <w:rFonts w:hint="eastAsia"/>
+                <w:szCs w:val="21"/>
+              </w:rPr>
+              <w:br/>
+            </w:r>
+            <w:r>
+              <w:rPr>
+                <w:rFonts w:hint="eastAsia"/>
+                <w:szCs w:val="21"/>
+              </w:rPr>
+              <w:t>建模方面：</w:t>
+            </w:r>
+            <w:r>
+              <w:rPr>
+                <w:rFonts w:hint="eastAsia"/>
+                <w:szCs w:val="21"/>
+              </w:rPr>
+              <w:t xml:space="preserve">use-case </w:t>
+            </w:r>
+            <w:r>
+              <w:rPr>
+                <w:rFonts w:hint="eastAsia"/>
+                <w:szCs w:val="21"/>
+              </w:rPr>
+              <w:t>图和概念类图应先建立覆盖各大模块的整体模型，再对用例分类进行精简。</w:t>
+            </w:r>
+            <w:r>
+              <w:rPr>
+                <w:rFonts w:hint="eastAsia"/>
+                <w:szCs w:val="21"/>
+              </w:rPr>
+              <w:br/>
+            </w:r>
+            <w:r>
+              <w:rPr>
+                <w:rFonts w:hint="eastAsia"/>
+                <w:szCs w:val="21"/>
+              </w:rPr>
+              <w:t>鲁棒性方面：对错误字段应分级处理，根据场景选择展示缺省值、显式报错并禁用后续操作，或使用</w:t>
+            </w:r>
+            <w:r>
+              <w:rPr>
+                <w:rFonts w:hint="eastAsia"/>
+                <w:szCs w:val="21"/>
+              </w:rPr>
+              <w:t xml:space="preserve"> try-catch </w:t>
+            </w:r>
+            <w:r>
+              <w:rPr>
+                <w:rFonts w:hint="eastAsia"/>
+                <w:szCs w:val="21"/>
+              </w:rPr>
+              <w:t>进行捕获。</w:t>
             </w:r>
           </w:p>
         </w:tc>
@@ -661,7 +1066,7 @@
 </file>
 
 <file path=word/endnotes.xml><?xml version="1.0" encoding="utf-8"?>
-<w:endnotes xmlns:wpc="http://schemas.microsoft.com/office/word/2010/wordprocessingCanvas" xmlns:cx="http://schemas.microsoft.com/office/drawing/2014/chartex" xmlns:cx1="http://schemas.microsoft.com/office/drawing/2015/9/8/chartex" xmlns:cx2="http://schemas.microsoft.com/office/drawing/2015/10/21/chartex" xmlns:cx3="http://schemas.microsoft.com/office/drawing/2016/5/9/chartex" xmlns:cx4="http://schemas.microsoft.com/office/drawing/2016/5/10/chartex" xmlns:cx5="http://schemas.microsoft.com/office/drawing/2016/5/11/chartex" xmlns:cx6="http://schemas.microsoft.com/office/drawing/2016/5/12/chartex" xmlns:cx7="http://schemas.microsoft.com/office/drawing/2016/5/13/chartex" xmlns:cx8="http://schemas.microsoft.com/office/drawing/2016/5/14/chartex" xmlns:mc="http://schemas.openxmlformats.org/markup-compatibility/2006" xmlns:aink="http://schemas.microsoft.com/office/drawing/2016/ink" xmlns:am3d="http://schemas.microsoft.com/office/drawing/2017/model3d" xmlns:o="urn:schemas-microsoft-com:office:office" xmlns:r="http://schemas.openxmlformats.org/officeDocument/2006/relationships" xmlns:m="http://schemas.openxmlformats.org/officeDocument/2006/math" xmlns:v="urn:schemas-microsoft-com:vml" xmlns:wp14="http://schemas.microsoft.com/office/word/2010/wordprocessingDrawing" xmlns:wp="http://schemas.openxmlformats.org/drawingml/2006/wordprocessingDrawing" xmlns:w10="urn:schemas-microsoft-com:office:word" xmlns:w="http://schemas.openxmlformats.org/wordprocessingml/2006/main" xmlns:w14="http://schemas.microsoft.com/office/word/2010/wordml" xmlns:w15="http://schemas.microsoft.com/office/word/2012/wordml" xmlns:w16cex="http://schemas.microsoft.com/office/word/2018/wordml/cex" xmlns:w16cid="http://schemas.microsoft.com/office/word/2016/wordml/cid" xmlns:w16="http://schemas.microsoft.com/office/word/2018/wordml" xmlns:w16sdtdh="http://schemas.microsoft.com/office/word/2020/wordml/sdtdatahash" xmlns:w16se="http://schemas.microsoft.com/office/word/2015/wordml/symex" xmlns:wpg="http://schemas.microsoft.com/office/word/2010/wordprocessingGroup" xmlns:wpi="http://schemas.microsoft.com/office/word/2010/wordprocessingInk" xmlns:wne="http://schemas.microsoft.com/office/word/2006/wordml" xmlns:wps="http://schemas.microsoft.com/office/word/2010/wordprocessingShape" mc:Ignorable="w14 w15 w16se w16cid w16 w16cex w16sdtdh wp14">
+<w:endnotes xmlns:wpc="http://schemas.microsoft.com/office/word/2010/wordprocessingCanvas" xmlns:cx="http://schemas.microsoft.com/office/drawing/2014/chartex" xmlns:cx1="http://schemas.microsoft.com/office/drawing/2015/9/8/chartex" xmlns:cx2="http://schemas.microsoft.com/office/drawing/2015/10/21/chartex" xmlns:cx3="http://schemas.microsoft.com/office/drawing/2016/5/9/chartex" xmlns:cx4="http://schemas.microsoft.com/office/drawing/2016/5/10/chartex" xmlns:cx5="http://schemas.microsoft.com/office/drawing/2016/5/11/chartex" xmlns:cx6="http://schemas.microsoft.com/office/drawing/2016/5/12/chartex" xmlns:cx7="http://schemas.microsoft.com/office/drawing/2016/5/13/chartex" xmlns:cx8="http://schemas.microsoft.com/office/drawing/2016/5/14/chartex" xmlns:mc="http://schemas.openxmlformats.org/markup-compatibility/2006" xmlns:aink="http://schemas.microsoft.com/office/drawing/2016/ink" xmlns:am3d="http://schemas.microsoft.com/office/drawing/2017/model3d" xmlns:o="urn:schemas-microsoft-com:office:office" xmlns:oel="http://schemas.microsoft.com/office/2019/extlst" xmlns:r="http://schemas.openxmlformats.org/officeDocument/2006/relationships" xmlns:m="http://schemas.openxmlformats.org/officeDocument/2006/math" xmlns:v="urn:schemas-microsoft-com:vml" xmlns:wp14="http://schemas.microsoft.com/office/word/2010/wordprocessingDrawing" xmlns:wp="http://schemas.openxmlformats.org/drawingml/2006/wordprocessingDrawing" xmlns:w10="urn:schemas-microsoft-com:office:word" xmlns:w="http://schemas.openxmlformats.org/wordprocessingml/2006/main" xmlns:w14="http://schemas.microsoft.com/office/word/2010/wordml" xmlns:w15="http://schemas.microsoft.com/office/word/2012/wordml" xmlns:w16cex="http://schemas.microsoft.com/office/word/2018/wordml/cex" xmlns:w16cid="http://schemas.microsoft.com/office/word/2016/wordml/cid" xmlns:w16="http://schemas.microsoft.com/office/word/2018/wordml" xmlns:w16du="http://schemas.microsoft.com/office/word/2023/wordml/word16du" xmlns:w16sdtdh="http://schemas.microsoft.com/office/word/2020/wordml/sdtdatahash" xmlns:w16sdtfl="http://schemas.microsoft.com/office/word/2024/wordml/sdtformatlock" xmlns:w16se="http://schemas.microsoft.com/office/word/2015/wordml/symex" xmlns:wpg="http://schemas.microsoft.com/office/word/2010/wordprocessingGroup" xmlns:wpi="http://schemas.microsoft.com/office/word/2010/wordprocessingInk" xmlns:wne="http://schemas.microsoft.com/office/word/2006/wordml" xmlns:wps="http://schemas.microsoft.com/office/word/2010/wordprocessingShape" mc:Ignorable="w14 w15 w16se w16cid w16 w16cex w16sdtdh w16sdtfl w16du wp14">
   <w:endnote w:type="separator" w:id="-1">
     <w:p>
       <w:r>
@@ -680,7 +1085,7 @@
 </file>
 
 <file path=word/footnotes.xml><?xml version="1.0" encoding="utf-8"?>
-<w:footnotes xmlns:wpc="http://schemas.microsoft.com/office/word/2010/wordprocessingCanvas" xmlns:cx="http://schemas.microsoft.com/office/drawing/2014/chartex" xmlns:cx1="http://schemas.microsoft.com/office/drawing/2015/9/8/chartex" xmlns:cx2="http://schemas.microsoft.com/office/drawing/2015/10/21/chartex" xmlns:cx3="http://schemas.microsoft.com/office/drawing/2016/5/9/chartex" xmlns:cx4="http://schemas.microsoft.com/office/drawing/2016/5/10/chartex" xmlns:cx5="http://schemas.microsoft.com/office/drawing/2016/5/11/chartex" xmlns:cx6="http://schemas.microsoft.com/office/drawing/2016/5/12/chartex" xmlns:cx7="http://schemas.microsoft.com/office/drawing/2016/5/13/chartex" xmlns:cx8="http://schemas.microsoft.com/office/drawing/2016/5/14/chartex" xmlns:mc="http://schemas.openxmlformats.org/markup-compatibility/2006" xmlns:aink="http://schemas.microsoft.com/office/drawing/2016/ink" xmlns:am3d="http://schemas.microsoft.com/office/drawing/2017/model3d" xmlns:o="urn:schemas-microsoft-com:office:office" xmlns:r="http://schemas.openxmlformats.org/officeDocument/2006/relationships" xmlns:m="http://schemas.openxmlformats.org/officeDocument/2006/math" xmlns:v="urn:schemas-microsoft-com:vml" xmlns:wp14="http://schemas.microsoft.com/office/word/2010/wordprocessingDrawing" xmlns:wp="http://schemas.openxmlformats.org/drawingml/2006/wordprocessingDrawing" xmlns:w10="urn:schemas-microsoft-com:office:word" xmlns:w="http://schemas.openxmlformats.org/wordprocessingml/2006/main" xmlns:w14="http://schemas.microsoft.com/office/word/2010/wordml" xmlns:w15="http://schemas.microsoft.com/office/word/2012/wordml" xmlns:w16cex="http://schemas.microsoft.com/office/word/2018/wordml/cex" xmlns:w16cid="http://schemas.microsoft.com/office/word/2016/wordml/cid" xmlns:w16="http://schemas.microsoft.com/office/word/2018/wordml" xmlns:w16sdtdh="http://schemas.microsoft.com/office/word/2020/wordml/sdtdatahash" xmlns:w16se="http://schemas.microsoft.com/office/word/2015/wordml/symex" xmlns:wpg="http://schemas.microsoft.com/office/word/2010/wordprocessingGroup" xmlns:wpi="http://schemas.microsoft.com/office/word/2010/wordprocessingInk" xmlns:wne="http://schemas.microsoft.com/office/word/2006/wordml" xmlns:wps="http://schemas.microsoft.com/office/word/2010/wordprocessingShape" mc:Ignorable="w14 w15 w16se w16cid w16 w16cex w16sdtdh wp14">
+<w:footnotes xmlns:wpc="http://schemas.microsoft.com/office/word/2010/wordprocessingCanvas" xmlns:cx="http://schemas.microsoft.com/office/drawing/2014/chartex" xmlns:cx1="http://schemas.microsoft.com/office/drawing/2015/9/8/chartex" xmlns:cx2="http://schemas.microsoft.com/office/drawing/2015/10/21/chartex" xmlns:cx3="http://schemas.microsoft.com/office/drawing/2016/5/9/chartex" xmlns:cx4="http://schemas.microsoft.com/office/drawing/2016/5/10/chartex" xmlns:cx5="http://schemas.microsoft.com/office/drawing/2016/5/11/chartex" xmlns:cx6="http://schemas.microsoft.com/office/drawing/2016/5/12/chartex" xmlns:cx7="http://schemas.microsoft.com/office/drawing/2016/5/13/chartex" xmlns:cx8="http://schemas.microsoft.com/office/drawing/2016/5/14/chartex" xmlns:mc="http://schemas.openxmlformats.org/markup-compatibility/2006" xmlns:aink="http://schemas.microsoft.com/office/drawing/2016/ink" xmlns:am3d="http://schemas.microsoft.com/office/drawing/2017/model3d" xmlns:o="urn:schemas-microsoft-com:office:office" xmlns:oel="http://schemas.microsoft.com/office/2019/extlst" xmlns:r="http://schemas.openxmlformats.org/officeDocument/2006/relationships" xmlns:m="http://schemas.openxmlformats.org/officeDocument/2006/math" xmlns:v="urn:schemas-microsoft-com:vml" xmlns:wp14="http://schemas.microsoft.com/office/word/2010/wordprocessingDrawing" xmlns:wp="http://schemas.openxmlformats.org/drawingml/2006/wordprocessingDrawing" xmlns:w10="urn:schemas-microsoft-com:office:word" xmlns:w="http://schemas.openxmlformats.org/wordprocessingml/2006/main" xmlns:w14="http://schemas.microsoft.com/office/word/2010/wordml" xmlns:w15="http://schemas.microsoft.com/office/word/2012/wordml" xmlns:w16cex="http://schemas.microsoft.com/office/word/2018/wordml/cex" xmlns:w16cid="http://schemas.microsoft.com/office/word/2016/wordml/cid" xmlns:w16="http://schemas.microsoft.com/office/word/2018/wordml" xmlns:w16du="http://schemas.microsoft.com/office/word/2023/wordml/word16du" xmlns:w16sdtdh="http://schemas.microsoft.com/office/word/2020/wordml/sdtdatahash" xmlns:w16sdtfl="http://schemas.microsoft.com/office/word/2024/wordml/sdtformatlock" xmlns:w16se="http://schemas.microsoft.com/office/word/2015/wordml/symex" xmlns:wpg="http://schemas.microsoft.com/office/word/2010/wordprocessingGroup" xmlns:wpi="http://schemas.microsoft.com/office/word/2010/wordprocessingInk" xmlns:wne="http://schemas.microsoft.com/office/word/2006/wordml" xmlns:wps="http://schemas.microsoft.com/office/word/2010/wordprocessingShape" mc:Ignorable="w14 w15 w16se w16cid w16 w16cex w16sdtdh w16sdtfl w16du wp14">
   <w:footnote w:type="separator" w:id="-1">
     <w:p>
       <w:r>
@@ -699,7 +1104,7 @@
 </file>
 
 <file path=word/styles.xml><?xml version="1.0" encoding="utf-8"?>
-<w:styles xmlns:mc="http://schemas.openxmlformats.org/markup-compatibility/2006" xmlns:r="http://schemas.openxmlformats.org/officeDocument/2006/relationships" xmlns:w="http://schemas.openxmlformats.org/wordprocessingml/2006/main" xmlns:w14="http://schemas.microsoft.com/office/word/2010/wordml" xmlns:w15="http://schemas.microsoft.com/office/word/2012/wordml" xmlns:w16cex="http://schemas.microsoft.com/office/word/2018/wordml/cex" xmlns:w16cid="http://schemas.microsoft.com/office/word/2016/wordml/cid" xmlns:w16="http://schemas.microsoft.com/office/word/2018/wordml" xmlns:w16sdtdh="http://schemas.microsoft.com/office/word/2020/wordml/sdtdatahash" xmlns:w16se="http://schemas.microsoft.com/office/word/2015/wordml/symex" mc:Ignorable="w14 w15 w16se w16cid w16 w16cex w16sdtdh">
+<w:styles xmlns:mc="http://schemas.openxmlformats.org/markup-compatibility/2006" xmlns:r="http://schemas.openxmlformats.org/officeDocument/2006/relationships" xmlns:w="http://schemas.openxmlformats.org/wordprocessingml/2006/main" xmlns:w14="http://schemas.microsoft.com/office/word/2010/wordml" xmlns:w15="http://schemas.microsoft.com/office/word/2012/wordml" xmlns:w16cex="http://schemas.microsoft.com/office/word/2018/wordml/cex" xmlns:w16cid="http://schemas.microsoft.com/office/word/2016/wordml/cid" xmlns:w16="http://schemas.microsoft.com/office/word/2018/wordml" xmlns:w16du="http://schemas.microsoft.com/office/word/2023/wordml/word16du" xmlns:w16sdtdh="http://schemas.microsoft.com/office/word/2020/wordml/sdtdatahash" xmlns:w16sdtfl="http://schemas.microsoft.com/office/word/2024/wordml/sdtformatlock" xmlns:w16se="http://schemas.microsoft.com/office/word/2015/wordml/symex" mc:Ignorable="w14 w15 w16se w16cid w16 w16cex w16sdtdh w16sdtfl w16du">
   <w:docDefaults>
     <w:rPrDefault>
       <w:rPr>
@@ -726,6 +1131,7 @@
     <w:lsdException w:name="Strong" w:qFormat="1"/>
     <w:lsdException w:name="Emphasis" w:qFormat="1"/>
     <w:lsdException w:name="HTML Keyboard" w:semiHidden="1" w:unhideWhenUsed="1"/>
+    <w:lsdException w:name="Normal Table" w:semiHidden="1" w:unhideWhenUsed="1"/>
     <w:lsdException w:name="annotation subject" w:semiHidden="1" w:unhideWhenUsed="1"/>
     <w:lsdException w:name="No List" w:semiHidden="1" w:unhideWhenUsed="1"/>
     <w:lsdException w:name="Outline List 1" w:semiHidden="1" w:unhideWhenUsed="1"/>
@@ -768,8 +1174,11 @@
     <w:lsdException w:name="Table Contemporary" w:semiHidden="1" w:unhideWhenUsed="1"/>
     <w:lsdException w:name="Table Elegant" w:semiHidden="1" w:unhideWhenUsed="1"/>
     <w:lsdException w:name="Table Professional" w:semiHidden="1" w:unhideWhenUsed="1"/>
+    <w:lsdException w:name="Table Subtle 1" w:semiHidden="1" w:unhideWhenUsed="1"/>
     <w:lsdException w:name="Table Subtle 2" w:semiHidden="1" w:unhideWhenUsed="1"/>
     <w:lsdException w:name="Table Web 1" w:semiHidden="1" w:unhideWhenUsed="1"/>
+    <w:lsdException w:name="Table Web 2" w:semiHidden="1" w:unhideWhenUsed="1"/>
+    <w:lsdException w:name="Table Web 3" w:semiHidden="1" w:unhideWhenUsed="1"/>
     <w:lsdException w:name="Balloon Text" w:semiHidden="1" w:unhideWhenUsed="1"/>
     <w:lsdException w:name="Table Theme" w:semiHidden="1" w:unhideWhenUsed="1"/>
     <w:lsdException w:name="Placeholder Text" w:semiHidden="1" w:uiPriority="99"/>

</xml_diff>